<commit_message>
modification of a visual
modification of a visual
</commit_message>
<xml_diff>
--- a/Midsem.docx
+++ b/Midsem.docx
@@ -5,12 +5,14 @@
     <w:p>
       <w:pPr>
         <w:rPr>
+          <w:rFonts w:ascii="Times New Roman" w:hAnsi="Times New Roman" w:cs="Times New Roman"/>
           <w:b/>
           <w:bCs/>
         </w:rPr>
       </w:pPr>
       <w:r>
         <w:rPr>
+          <w:rFonts w:ascii="Times New Roman" w:hAnsi="Times New Roman" w:cs="Times New Roman"/>
           <w:b/>
           <w:bCs/>
         </w:rPr>
@@ -18,19 +20,29 @@
       </w:r>
     </w:p>
     <w:p>
-      <w:r>
+      <w:pPr>
+        <w:rPr>
+          <w:rFonts w:ascii="Times New Roman" w:hAnsi="Times New Roman" w:cs="Times New Roman"/>
+        </w:rPr>
+      </w:pPr>
+      <w:r>
+        <w:rPr>
+          <w:rFonts w:ascii="Times New Roman" w:hAnsi="Times New Roman" w:cs="Times New Roman"/>
+        </w:rPr>
         <w:t>Use Power Query to clean, transform, and prepare the dataset.</w:t>
       </w:r>
     </w:p>
     <w:p>
       <w:pPr>
         <w:rPr>
+          <w:rFonts w:ascii="Times New Roman" w:hAnsi="Times New Roman" w:cs="Times New Roman"/>
           <w:b/>
           <w:bCs/>
         </w:rPr>
       </w:pPr>
       <w:r>
         <w:rPr>
+          <w:rFonts w:ascii="Times New Roman" w:hAnsi="Times New Roman" w:cs="Times New Roman"/>
           <w:b/>
           <w:bCs/>
         </w:rPr>
@@ -43,13 +55,28 @@
           <w:ilvl w:val="0"/>
           <w:numId w:val="1"/>
         </w:numPr>
-      </w:pPr>
-      <w:r>
+        <w:rPr>
+          <w:rFonts w:ascii="Times New Roman" w:hAnsi="Times New Roman" w:cs="Times New Roman"/>
+        </w:rPr>
+      </w:pPr>
+      <w:r>
+        <w:rPr>
+          <w:rFonts w:ascii="Times New Roman" w:hAnsi="Times New Roman" w:cs="Times New Roman"/>
+        </w:rPr>
         <w:t>Rename unclear columns. (2 Marks)</w:t>
       </w:r>
     </w:p>
     <w:p>
-      <w:r>
+      <w:pPr>
+        <w:rPr>
+          <w:rFonts w:ascii="Times New Roman" w:hAnsi="Times New Roman" w:cs="Times New Roman"/>
+        </w:rPr>
+      </w:pPr>
+      <w:r>
+        <w:rPr>
+          <w:rFonts w:ascii="Times New Roman" w:hAnsi="Times New Roman" w:cs="Times New Roman"/>
+          <w:noProof/>
+        </w:rPr>
         <w:drawing>
           <wp:inline distT="0" distB="0" distL="0" distR="0" wp14:anchorId="1DEA69CE" wp14:editId="48B52C2A">
             <wp:extent cx="5943600" cy="1500505"/>
@@ -93,13 +120,28 @@
           <w:ilvl w:val="0"/>
           <w:numId w:val="1"/>
         </w:numPr>
-      </w:pPr>
-      <w:r>
+        <w:rPr>
+          <w:rFonts w:ascii="Times New Roman" w:hAnsi="Times New Roman" w:cs="Times New Roman"/>
+        </w:rPr>
+      </w:pPr>
+      <w:r>
+        <w:rPr>
+          <w:rFonts w:ascii="Times New Roman" w:hAnsi="Times New Roman" w:cs="Times New Roman"/>
+        </w:rPr>
         <w:t>Change data types correctly. (2 Marks)</w:t>
       </w:r>
     </w:p>
     <w:p>
-      <w:r>
+      <w:pPr>
+        <w:rPr>
+          <w:rFonts w:ascii="Times New Roman" w:hAnsi="Times New Roman" w:cs="Times New Roman"/>
+        </w:rPr>
+      </w:pPr>
+      <w:r>
+        <w:rPr>
+          <w:rFonts w:ascii="Times New Roman" w:hAnsi="Times New Roman" w:cs="Times New Roman"/>
+          <w:noProof/>
+        </w:rPr>
         <w:drawing>
           <wp:inline distT="0" distB="0" distL="0" distR="0" wp14:anchorId="2C2889BA" wp14:editId="059B809D">
             <wp:extent cx="5943600" cy="1637030"/>
@@ -143,13 +185,28 @@
           <w:ilvl w:val="0"/>
           <w:numId w:val="1"/>
         </w:numPr>
-      </w:pPr>
-      <w:r>
+        <w:rPr>
+          <w:rFonts w:ascii="Times New Roman" w:hAnsi="Times New Roman" w:cs="Times New Roman"/>
+        </w:rPr>
+      </w:pPr>
+      <w:r>
+        <w:rPr>
+          <w:rFonts w:ascii="Times New Roman" w:hAnsi="Times New Roman" w:cs="Times New Roman"/>
+        </w:rPr>
         <w:t>Remove duplicate records. (2 Marks)</w:t>
       </w:r>
     </w:p>
     <w:p>
-      <w:r>
+      <w:pPr>
+        <w:rPr>
+          <w:rFonts w:ascii="Times New Roman" w:hAnsi="Times New Roman" w:cs="Times New Roman"/>
+        </w:rPr>
+      </w:pPr>
+      <w:r>
+        <w:rPr>
+          <w:rFonts w:ascii="Times New Roman" w:hAnsi="Times New Roman" w:cs="Times New Roman"/>
+          <w:noProof/>
+        </w:rPr>
         <w:drawing>
           <wp:inline distT="0" distB="0" distL="0" distR="0" wp14:anchorId="28666639" wp14:editId="060588AA">
             <wp:extent cx="5943600" cy="1784985"/>
@@ -193,13 +250,28 @@
           <w:ilvl w:val="0"/>
           <w:numId w:val="1"/>
         </w:numPr>
-      </w:pPr>
-      <w:r>
+        <w:rPr>
+          <w:rFonts w:ascii="Times New Roman" w:hAnsi="Times New Roman" w:cs="Times New Roman"/>
+        </w:rPr>
+      </w:pPr>
+      <w:r>
+        <w:rPr>
+          <w:rFonts w:ascii="Times New Roman" w:hAnsi="Times New Roman" w:cs="Times New Roman"/>
+        </w:rPr>
         <w:t>Remove blank rows. (2 Marks)</w:t>
       </w:r>
     </w:p>
     <w:p>
-      <w:r>
+      <w:pPr>
+        <w:rPr>
+          <w:rFonts w:ascii="Times New Roman" w:hAnsi="Times New Roman" w:cs="Times New Roman"/>
+        </w:rPr>
+      </w:pPr>
+      <w:r>
+        <w:rPr>
+          <w:rFonts w:ascii="Times New Roman" w:hAnsi="Times New Roman" w:cs="Times New Roman"/>
+          <w:noProof/>
+        </w:rPr>
         <w:lastRenderedPageBreak/>
         <w:drawing>
           <wp:inline distT="0" distB="0" distL="0" distR="0" wp14:anchorId="514CA840" wp14:editId="7AFAD788">
@@ -244,13 +316,28 @@
           <w:ilvl w:val="0"/>
           <w:numId w:val="1"/>
         </w:numPr>
-      </w:pPr>
-      <w:r>
+        <w:rPr>
+          <w:rFonts w:ascii="Times New Roman" w:hAnsi="Times New Roman" w:cs="Times New Roman"/>
+        </w:rPr>
+      </w:pPr>
+      <w:r>
+        <w:rPr>
+          <w:rFonts w:ascii="Times New Roman" w:hAnsi="Times New Roman" w:cs="Times New Roman"/>
+        </w:rPr>
         <w:t>Trim and clean text columns. (2 Marks)</w:t>
       </w:r>
     </w:p>
     <w:p>
-      <w:r>
+      <w:pPr>
+        <w:rPr>
+          <w:rFonts w:ascii="Times New Roman" w:hAnsi="Times New Roman" w:cs="Times New Roman"/>
+        </w:rPr>
+      </w:pPr>
+      <w:r>
+        <w:rPr>
+          <w:rFonts w:ascii="Times New Roman" w:hAnsi="Times New Roman" w:cs="Times New Roman"/>
+          <w:noProof/>
+        </w:rPr>
         <w:drawing>
           <wp:inline distT="0" distB="0" distL="0" distR="0" wp14:anchorId="5D76319E" wp14:editId="3194F181">
             <wp:extent cx="5943600" cy="1995805"/>
@@ -294,13 +381,28 @@
           <w:ilvl w:val="0"/>
           <w:numId w:val="1"/>
         </w:numPr>
-      </w:pPr>
-      <w:r>
+        <w:rPr>
+          <w:rFonts w:ascii="Times New Roman" w:hAnsi="Times New Roman" w:cs="Times New Roman"/>
+        </w:rPr>
+      </w:pPr>
+      <w:r>
+        <w:rPr>
+          <w:rFonts w:ascii="Times New Roman" w:hAnsi="Times New Roman" w:cs="Times New Roman"/>
+        </w:rPr>
         <w:t>Replace inconsistent values. (2 Marks)</w:t>
       </w:r>
     </w:p>
     <w:p>
-      <w:r>
+      <w:pPr>
+        <w:rPr>
+          <w:rFonts w:ascii="Times New Roman" w:hAnsi="Times New Roman" w:cs="Times New Roman"/>
+        </w:rPr>
+      </w:pPr>
+      <w:r>
+        <w:rPr>
+          <w:rFonts w:ascii="Times New Roman" w:hAnsi="Times New Roman" w:cs="Times New Roman"/>
+          <w:noProof/>
+        </w:rPr>
         <w:drawing>
           <wp:inline distT="0" distB="0" distL="0" distR="0" wp14:anchorId="13D216FF" wp14:editId="460BD401">
             <wp:extent cx="5943600" cy="2096135"/>
@@ -344,13 +446,28 @@
           <w:ilvl w:val="0"/>
           <w:numId w:val="1"/>
         </w:numPr>
-      </w:pPr>
-      <w:r>
+        <w:rPr>
+          <w:rFonts w:ascii="Times New Roman" w:hAnsi="Times New Roman" w:cs="Times New Roman"/>
+        </w:rPr>
+      </w:pPr>
+      <w:r>
+        <w:rPr>
+          <w:rFonts w:ascii="Times New Roman" w:hAnsi="Times New Roman" w:cs="Times New Roman"/>
+        </w:rPr>
         <w:t>Remove unnecessary columns. (3 Marks)</w:t>
       </w:r>
     </w:p>
     <w:p>
-      <w:r>
+      <w:pPr>
+        <w:rPr>
+          <w:rFonts w:ascii="Times New Roman" w:hAnsi="Times New Roman" w:cs="Times New Roman"/>
+        </w:rPr>
+      </w:pPr>
+      <w:r>
+        <w:rPr>
+          <w:rFonts w:ascii="Times New Roman" w:hAnsi="Times New Roman" w:cs="Times New Roman"/>
+          <w:noProof/>
+        </w:rPr>
         <w:lastRenderedPageBreak/>
         <w:drawing>
           <wp:inline distT="0" distB="0" distL="0" distR="0" wp14:anchorId="0F70CE77" wp14:editId="47783B15">
@@ -392,12 +509,14 @@
     <w:p>
       <w:pPr>
         <w:rPr>
+          <w:rFonts w:ascii="Times New Roman" w:hAnsi="Times New Roman" w:cs="Times New Roman"/>
           <w:b/>
           <w:bCs/>
         </w:rPr>
       </w:pPr>
       <w:r>
         <w:rPr>
+          <w:rFonts w:ascii="Times New Roman" w:hAnsi="Times New Roman" w:cs="Times New Roman"/>
           <w:b/>
           <w:bCs/>
         </w:rPr>
@@ -410,13 +529,28 @@
           <w:ilvl w:val="0"/>
           <w:numId w:val="2"/>
         </w:numPr>
-      </w:pPr>
-      <w:r>
+        <w:rPr>
+          <w:rFonts w:ascii="Times New Roman" w:hAnsi="Times New Roman" w:cs="Times New Roman"/>
+        </w:rPr>
+      </w:pPr>
+      <w:r>
+        <w:rPr>
+          <w:rFonts w:ascii="Times New Roman" w:hAnsi="Times New Roman" w:cs="Times New Roman"/>
+        </w:rPr>
         <w:t>Split one column into multiple columns. (2 Marks)</w:t>
       </w:r>
     </w:p>
     <w:p>
-      <w:r>
+      <w:pPr>
+        <w:rPr>
+          <w:rFonts w:ascii="Times New Roman" w:hAnsi="Times New Roman" w:cs="Times New Roman"/>
+        </w:rPr>
+      </w:pPr>
+      <w:r>
+        <w:rPr>
+          <w:rFonts w:ascii="Times New Roman" w:hAnsi="Times New Roman" w:cs="Times New Roman"/>
+          <w:noProof/>
+        </w:rPr>
         <w:drawing>
           <wp:inline distT="0" distB="0" distL="0" distR="0" wp14:anchorId="48A991CD" wp14:editId="07480623">
             <wp:extent cx="5943600" cy="1372235"/>
@@ -460,16 +594,29 @@
           <w:ilvl w:val="0"/>
           <w:numId w:val="2"/>
         </w:numPr>
-      </w:pPr>
-      <w:r>
+        <w:rPr>
+          <w:rFonts w:ascii="Times New Roman" w:hAnsi="Times New Roman" w:cs="Times New Roman"/>
+        </w:rPr>
+      </w:pPr>
+      <w:r>
+        <w:rPr>
+          <w:rFonts w:ascii="Times New Roman" w:hAnsi="Times New Roman" w:cs="Times New Roman"/>
+        </w:rPr>
         <w:t>Merge two or more columns. (2 Marks)</w:t>
       </w:r>
     </w:p>
     <w:p>
       <w:pPr>
         <w:ind w:left="360"/>
-      </w:pPr>
-      <w:r>
+        <w:rPr>
+          <w:rFonts w:ascii="Times New Roman" w:hAnsi="Times New Roman" w:cs="Times New Roman"/>
+        </w:rPr>
+      </w:pPr>
+      <w:r>
+        <w:rPr>
+          <w:rFonts w:ascii="Times New Roman" w:hAnsi="Times New Roman" w:cs="Times New Roman"/>
+          <w:noProof/>
+        </w:rPr>
         <w:drawing>
           <wp:inline distT="0" distB="0" distL="0" distR="0" wp14:anchorId="5F927B3B" wp14:editId="4A78C114">
             <wp:extent cx="5943600" cy="1325880"/>
@@ -513,16 +660,29 @@
           <w:ilvl w:val="0"/>
           <w:numId w:val="2"/>
         </w:numPr>
-      </w:pPr>
-      <w:r>
+        <w:rPr>
+          <w:rFonts w:ascii="Times New Roman" w:hAnsi="Times New Roman" w:cs="Times New Roman"/>
+        </w:rPr>
+      </w:pPr>
+      <w:r>
+        <w:rPr>
+          <w:rFonts w:ascii="Times New Roman" w:hAnsi="Times New Roman" w:cs="Times New Roman"/>
+        </w:rPr>
         <w:t>Create a custom column. (3 Marks)</w:t>
       </w:r>
     </w:p>
     <w:p>
       <w:pPr>
         <w:ind w:left="360"/>
-      </w:pPr>
-      <w:r>
+        <w:rPr>
+          <w:rFonts w:ascii="Times New Roman" w:hAnsi="Times New Roman" w:cs="Times New Roman"/>
+        </w:rPr>
+      </w:pPr>
+      <w:r>
+        <w:rPr>
+          <w:rFonts w:ascii="Times New Roman" w:hAnsi="Times New Roman" w:cs="Times New Roman"/>
+          <w:noProof/>
+        </w:rPr>
         <w:lastRenderedPageBreak/>
         <w:drawing>
           <wp:inline distT="0" distB="0" distL="0" distR="0" wp14:anchorId="19FBE7DE" wp14:editId="65CC274E">
@@ -567,13 +727,28 @@
           <w:ilvl w:val="0"/>
           <w:numId w:val="2"/>
         </w:numPr>
-      </w:pPr>
-      <w:r>
+        <w:rPr>
+          <w:rFonts w:ascii="Times New Roman" w:hAnsi="Times New Roman" w:cs="Times New Roman"/>
+        </w:rPr>
+      </w:pPr>
+      <w:r>
+        <w:rPr>
+          <w:rFonts w:ascii="Times New Roman" w:hAnsi="Times New Roman" w:cs="Times New Roman"/>
+        </w:rPr>
         <w:t>Create a conditional column. (3 Marks)</w:t>
       </w:r>
     </w:p>
     <w:p>
-      <w:r>
+      <w:pPr>
+        <w:rPr>
+          <w:rFonts w:ascii="Times New Roman" w:hAnsi="Times New Roman" w:cs="Times New Roman"/>
+        </w:rPr>
+      </w:pPr>
+      <w:r>
+        <w:rPr>
+          <w:rFonts w:ascii="Times New Roman" w:hAnsi="Times New Roman" w:cs="Times New Roman"/>
+          <w:noProof/>
+        </w:rPr>
         <w:drawing>
           <wp:inline distT="0" distB="0" distL="0" distR="0" wp14:anchorId="3EA4D243" wp14:editId="33F59532">
             <wp:extent cx="5943600" cy="1252220"/>
@@ -617,13 +792,28 @@
           <w:ilvl w:val="0"/>
           <w:numId w:val="2"/>
         </w:numPr>
-      </w:pPr>
-      <w:r>
+        <w:rPr>
+          <w:rFonts w:ascii="Times New Roman" w:hAnsi="Times New Roman" w:cs="Times New Roman"/>
+        </w:rPr>
+      </w:pPr>
+      <w:r>
+        <w:rPr>
+          <w:rFonts w:ascii="Times New Roman" w:hAnsi="Times New Roman" w:cs="Times New Roman"/>
+        </w:rPr>
         <w:t>Extract year, month, quarter, and day from a date column. (4 Marks)</w:t>
       </w:r>
     </w:p>
     <w:p>
-      <w:r>
+      <w:pPr>
+        <w:rPr>
+          <w:rFonts w:ascii="Times New Roman" w:hAnsi="Times New Roman" w:cs="Times New Roman"/>
+        </w:rPr>
+      </w:pPr>
+      <w:r>
+        <w:rPr>
+          <w:rFonts w:ascii="Times New Roman" w:hAnsi="Times New Roman" w:cs="Times New Roman"/>
+          <w:noProof/>
+        </w:rPr>
         <w:drawing>
           <wp:inline distT="0" distB="0" distL="0" distR="0" wp14:anchorId="7828DE6C" wp14:editId="031C482A">
             <wp:extent cx="5943600" cy="657225"/>
@@ -667,13 +857,28 @@
           <w:ilvl w:val="0"/>
           <w:numId w:val="2"/>
         </w:numPr>
-      </w:pPr>
-      <w:r>
+        <w:rPr>
+          <w:rFonts w:ascii="Times New Roman" w:hAnsi="Times New Roman" w:cs="Times New Roman"/>
+        </w:rPr>
+      </w:pPr>
+      <w:r>
+        <w:rPr>
+          <w:rFonts w:ascii="Times New Roman" w:hAnsi="Times New Roman" w:cs="Times New Roman"/>
+        </w:rPr>
         <w:t>Filter rows using at least two conditions. (2 Marks)</w:t>
       </w:r>
     </w:p>
     <w:p>
-      <w:r>
+      <w:pPr>
+        <w:rPr>
+          <w:rFonts w:ascii="Times New Roman" w:hAnsi="Times New Roman" w:cs="Times New Roman"/>
+        </w:rPr>
+      </w:pPr>
+      <w:r>
+        <w:rPr>
+          <w:rFonts w:ascii="Times New Roman" w:hAnsi="Times New Roman" w:cs="Times New Roman"/>
+          <w:noProof/>
+        </w:rPr>
         <w:drawing>
           <wp:inline distT="0" distB="0" distL="0" distR="0" wp14:anchorId="640A05C0" wp14:editId="4BC0DB04">
             <wp:extent cx="5943600" cy="1414780"/>
@@ -717,13 +922,28 @@
           <w:ilvl w:val="0"/>
           <w:numId w:val="2"/>
         </w:numPr>
-      </w:pPr>
-      <w:r>
+        <w:rPr>
+          <w:rFonts w:ascii="Times New Roman" w:hAnsi="Times New Roman" w:cs="Times New Roman"/>
+        </w:rPr>
+      </w:pPr>
+      <w:r>
+        <w:rPr>
+          <w:rFonts w:ascii="Times New Roman" w:hAnsi="Times New Roman" w:cs="Times New Roman"/>
+        </w:rPr>
         <w:t>Sort data meaningfully. (2 Marks)</w:t>
       </w:r>
     </w:p>
     <w:p>
-      <w:r>
+      <w:pPr>
+        <w:rPr>
+          <w:rFonts w:ascii="Times New Roman" w:hAnsi="Times New Roman" w:cs="Times New Roman"/>
+        </w:rPr>
+      </w:pPr>
+      <w:r>
+        <w:rPr>
+          <w:rFonts w:ascii="Times New Roman" w:hAnsi="Times New Roman" w:cs="Times New Roman"/>
+          <w:noProof/>
+        </w:rPr>
         <w:lastRenderedPageBreak/>
         <w:drawing>
           <wp:inline distT="0" distB="0" distL="0" distR="0" wp14:anchorId="34F849CB" wp14:editId="5230BFE3">
@@ -768,13 +988,28 @@
           <w:ilvl w:val="0"/>
           <w:numId w:val="2"/>
         </w:numPr>
-      </w:pPr>
-      <w:r>
+        <w:rPr>
+          <w:rFonts w:ascii="Times New Roman" w:hAnsi="Times New Roman" w:cs="Times New Roman"/>
+        </w:rPr>
+      </w:pPr>
+      <w:r>
+        <w:rPr>
+          <w:rFonts w:ascii="Times New Roman" w:hAnsi="Times New Roman" w:cs="Times New Roman"/>
+        </w:rPr>
         <w:t>Add an index column. (2 Marks)</w:t>
       </w:r>
     </w:p>
     <w:p>
-      <w:r>
+      <w:pPr>
+        <w:rPr>
+          <w:rFonts w:ascii="Times New Roman" w:hAnsi="Times New Roman" w:cs="Times New Roman"/>
+        </w:rPr>
+      </w:pPr>
+      <w:r>
+        <w:rPr>
+          <w:rFonts w:ascii="Times New Roman" w:hAnsi="Times New Roman" w:cs="Times New Roman"/>
+          <w:noProof/>
+        </w:rPr>
         <w:drawing>
           <wp:inline distT="0" distB="0" distL="0" distR="0" wp14:anchorId="39B1E971" wp14:editId="0E01C686">
             <wp:extent cx="5943600" cy="799465"/>
@@ -815,12 +1050,14 @@
     <w:p>
       <w:pPr>
         <w:rPr>
+          <w:rFonts w:ascii="Times New Roman" w:hAnsi="Times New Roman" w:cs="Times New Roman"/>
           <w:b/>
           <w:bCs/>
         </w:rPr>
       </w:pPr>
       <w:r>
         <w:rPr>
+          <w:rFonts w:ascii="Times New Roman" w:hAnsi="Times New Roman" w:cs="Times New Roman"/>
           <w:b/>
           <w:bCs/>
         </w:rPr>
@@ -828,32 +1065,56 @@
       </w:r>
     </w:p>
     <w:p>
-      <w:r>
+      <w:pPr>
+        <w:rPr>
+          <w:rFonts w:ascii="Times New Roman" w:hAnsi="Times New Roman" w:cs="Times New Roman"/>
+        </w:rPr>
+      </w:pPr>
+      <w:r>
+        <w:rPr>
+          <w:rFonts w:ascii="Times New Roman" w:hAnsi="Times New Roman" w:cs="Times New Roman"/>
+        </w:rPr>
         <w:t xml:space="preserve">Complete any </w:t>
       </w:r>
       <w:r>
         <w:rPr>
+          <w:rFonts w:ascii="Times New Roman" w:hAnsi="Times New Roman" w:cs="Times New Roman"/>
           <w:b/>
           <w:bCs/>
         </w:rPr>
         <w:t>five</w:t>
       </w:r>
       <w:r>
+        <w:rPr>
+          <w:rFonts w:ascii="Times New Roman" w:hAnsi="Times New Roman" w:cs="Times New Roman"/>
+        </w:rPr>
         <w:t xml:space="preserve"> of the following tasks.</w:t>
       </w:r>
     </w:p>
     <w:p>
-      <w:r>
+      <w:pPr>
+        <w:rPr>
+          <w:rFonts w:ascii="Times New Roman" w:hAnsi="Times New Roman" w:cs="Times New Roman"/>
+        </w:rPr>
+      </w:pPr>
+      <w:r>
+        <w:rPr>
+          <w:rFonts w:ascii="Times New Roman" w:hAnsi="Times New Roman" w:cs="Times New Roman"/>
+        </w:rPr>
         <w:t xml:space="preserve">Each task carries </w:t>
       </w:r>
       <w:r>
         <w:rPr>
+          <w:rFonts w:ascii="Times New Roman" w:hAnsi="Times New Roman" w:cs="Times New Roman"/>
           <w:b/>
           <w:bCs/>
         </w:rPr>
         <w:t>5 marks</w:t>
       </w:r>
       <w:r>
+        <w:rPr>
+          <w:rFonts w:ascii="Times New Roman" w:hAnsi="Times New Roman" w:cs="Times New Roman"/>
+        </w:rPr>
         <w:t>.</w:t>
       </w:r>
     </w:p>
@@ -863,8 +1124,14 @@
           <w:ilvl w:val="0"/>
           <w:numId w:val="3"/>
         </w:numPr>
-      </w:pPr>
-      <w:r>
+        <w:rPr>
+          <w:rFonts w:ascii="Times New Roman" w:hAnsi="Times New Roman" w:cs="Times New Roman"/>
+        </w:rPr>
+      </w:pPr>
+      <w:r>
+        <w:rPr>
+          <w:rFonts w:ascii="Times New Roman" w:hAnsi="Times New Roman" w:cs="Times New Roman"/>
+        </w:rPr>
         <w:t>Merge queries using a common key.</w:t>
       </w:r>
     </w:p>
@@ -874,12 +1141,21 @@
           <w:ilvl w:val="0"/>
           <w:numId w:val="3"/>
         </w:numPr>
-      </w:pPr>
-      <w:r>
+        <w:rPr>
+          <w:rFonts w:ascii="Times New Roman" w:hAnsi="Times New Roman" w:cs="Times New Roman"/>
+        </w:rPr>
+      </w:pPr>
+      <w:r>
+        <w:rPr>
+          <w:rFonts w:ascii="Times New Roman" w:hAnsi="Times New Roman" w:cs="Times New Roman"/>
+        </w:rPr>
         <w:t>Append two related datasets</w:t>
       </w:r>
       <w:proofErr w:type="gramStart"/>
       <w:r>
+        <w:rPr>
+          <w:rFonts w:ascii="Times New Roman" w:hAnsi="Times New Roman" w:cs="Times New Roman"/>
+        </w:rPr>
         <w:t>.</w:t>
       </w:r>
       <w:proofErr w:type="gramEnd"/>
@@ -890,8 +1166,14 @@
           <w:ilvl w:val="0"/>
           <w:numId w:val="3"/>
         </w:numPr>
-      </w:pPr>
-      <w:r>
+        <w:rPr>
+          <w:rFonts w:ascii="Times New Roman" w:hAnsi="Times New Roman" w:cs="Times New Roman"/>
+        </w:rPr>
+      </w:pPr>
+      <w:r>
+        <w:rPr>
+          <w:rFonts w:ascii="Times New Roman" w:hAnsi="Times New Roman" w:cs="Times New Roman"/>
+        </w:rPr>
         <w:t>Pivot a column.</w:t>
       </w:r>
     </w:p>
@@ -901,8 +1183,14 @@
           <w:ilvl w:val="0"/>
           <w:numId w:val="3"/>
         </w:numPr>
-      </w:pPr>
-      <w:r>
+        <w:rPr>
+          <w:rFonts w:ascii="Times New Roman" w:hAnsi="Times New Roman" w:cs="Times New Roman"/>
+        </w:rPr>
+      </w:pPr>
+      <w:r>
+        <w:rPr>
+          <w:rFonts w:ascii="Times New Roman" w:hAnsi="Times New Roman" w:cs="Times New Roman"/>
+        </w:rPr>
         <w:t>Unpivot columns.</w:t>
       </w:r>
     </w:p>
@@ -912,8 +1200,14 @@
           <w:ilvl w:val="0"/>
           <w:numId w:val="3"/>
         </w:numPr>
-      </w:pPr>
-      <w:r>
+        <w:rPr>
+          <w:rFonts w:ascii="Times New Roman" w:hAnsi="Times New Roman" w:cs="Times New Roman"/>
+        </w:rPr>
+      </w:pPr>
+      <w:r>
+        <w:rPr>
+          <w:rFonts w:ascii="Times New Roman" w:hAnsi="Times New Roman" w:cs="Times New Roman"/>
+        </w:rPr>
         <w:t>Create a parameter and use it to filter data.</w:t>
       </w:r>
     </w:p>
@@ -923,8 +1217,14 @@
           <w:ilvl w:val="0"/>
           <w:numId w:val="3"/>
         </w:numPr>
-      </w:pPr>
-      <w:r>
+        <w:rPr>
+          <w:rFonts w:ascii="Times New Roman" w:hAnsi="Times New Roman" w:cs="Times New Roman"/>
+        </w:rPr>
+      </w:pPr>
+      <w:r>
+        <w:rPr>
+          <w:rFonts w:ascii="Times New Roman" w:hAnsi="Times New Roman" w:cs="Times New Roman"/>
+        </w:rPr>
         <w:t>Create a date table in Power Query.</w:t>
       </w:r>
     </w:p>
@@ -934,8 +1234,14 @@
           <w:ilvl w:val="0"/>
           <w:numId w:val="3"/>
         </w:numPr>
-      </w:pPr>
-      <w:r>
+        <w:rPr>
+          <w:rFonts w:ascii="Times New Roman" w:hAnsi="Times New Roman" w:cs="Times New Roman"/>
+        </w:rPr>
+      </w:pPr>
+      <w:r>
+        <w:rPr>
+          <w:rFonts w:ascii="Times New Roman" w:hAnsi="Times New Roman" w:cs="Times New Roman"/>
+        </w:rPr>
         <w:t>Use Group By with multiple aggregations.</w:t>
       </w:r>
     </w:p>
@@ -945,8 +1251,14 @@
           <w:ilvl w:val="0"/>
           <w:numId w:val="3"/>
         </w:numPr>
-      </w:pPr>
-      <w:r>
+        <w:rPr>
+          <w:rFonts w:ascii="Times New Roman" w:hAnsi="Times New Roman" w:cs="Times New Roman"/>
+        </w:rPr>
+      </w:pPr>
+      <w:r>
+        <w:rPr>
+          <w:rFonts w:ascii="Times New Roman" w:hAnsi="Times New Roman" w:cs="Times New Roman"/>
+        </w:rPr>
         <w:t>Extract text before or after a delimiter.</w:t>
       </w:r>
     </w:p>
@@ -956,8 +1268,14 @@
           <w:ilvl w:val="0"/>
           <w:numId w:val="3"/>
         </w:numPr>
-      </w:pPr>
-      <w:r>
+        <w:rPr>
+          <w:rFonts w:ascii="Times New Roman" w:hAnsi="Times New Roman" w:cs="Times New Roman"/>
+        </w:rPr>
+      </w:pPr>
+      <w:r>
+        <w:rPr>
+          <w:rFonts w:ascii="Times New Roman" w:hAnsi="Times New Roman" w:cs="Times New Roman"/>
+        </w:rPr>
         <w:t>Remove or handle errors in a column.</w:t>
       </w:r>
     </w:p>
@@ -967,8 +1285,14 @@
           <w:ilvl w:val="0"/>
           <w:numId w:val="3"/>
         </w:numPr>
-      </w:pPr>
-      <w:r>
+        <w:rPr>
+          <w:rFonts w:ascii="Times New Roman" w:hAnsi="Times New Roman" w:cs="Times New Roman"/>
+        </w:rPr>
+      </w:pPr>
+      <w:r>
+        <w:rPr>
+          <w:rFonts w:ascii="Times New Roman" w:hAnsi="Times New Roman" w:cs="Times New Roman"/>
+        </w:rPr>
         <w:t>Create business categories using nested conditional logic.</w:t>
       </w:r>
     </w:p>
@@ -978,8 +1302,14 @@
           <w:ilvl w:val="0"/>
           <w:numId w:val="3"/>
         </w:numPr>
-      </w:pPr>
-      <w:r>
+        <w:rPr>
+          <w:rFonts w:ascii="Times New Roman" w:hAnsi="Times New Roman" w:cs="Times New Roman"/>
+        </w:rPr>
+      </w:pPr>
+      <w:r>
+        <w:rPr>
+          <w:rFonts w:ascii="Times New Roman" w:hAnsi="Times New Roman" w:cs="Times New Roman"/>
+        </w:rPr>
         <w:t>Create a summarized query using Reference Query.</w:t>
       </w:r>
     </w:p>
@@ -989,20 +1319,28 @@
           <w:ilvl w:val="0"/>
           <w:numId w:val="3"/>
         </w:numPr>
-      </w:pPr>
-      <w:r>
+        <w:rPr>
+          <w:rFonts w:ascii="Times New Roman" w:hAnsi="Times New Roman" w:cs="Times New Roman"/>
+        </w:rPr>
+      </w:pPr>
+      <w:r>
+        <w:rPr>
+          <w:rFonts w:ascii="Times New Roman" w:hAnsi="Times New Roman" w:cs="Times New Roman"/>
+        </w:rPr>
         <w:t>Use Column Profiling to identify data quality issues.</w:t>
       </w:r>
     </w:p>
     <w:p>
       <w:pPr>
         <w:rPr>
+          <w:rFonts w:ascii="Times New Roman" w:hAnsi="Times New Roman" w:cs="Times New Roman"/>
           <w:b/>
           <w:bCs/>
         </w:rPr>
       </w:pPr>
       <w:r>
         <w:rPr>
+          <w:rFonts w:ascii="Times New Roman" w:hAnsi="Times New Roman" w:cs="Times New Roman"/>
           <w:b/>
           <w:bCs/>
         </w:rPr>
@@ -1010,7 +1348,15 @@
       </w:r>
     </w:p>
     <w:p>
-      <w:r>
+      <w:pPr>
+        <w:rPr>
+          <w:rFonts w:ascii="Times New Roman" w:hAnsi="Times New Roman" w:cs="Times New Roman"/>
+        </w:rPr>
+      </w:pPr>
+      <w:r>
+        <w:rPr>
+          <w:rFonts w:ascii="Times New Roman" w:hAnsi="Times New Roman" w:cs="Times New Roman"/>
+        </w:rPr>
         <w:t>Students must include screenshots of:</w:t>
       </w:r>
     </w:p>
@@ -1020,8 +1366,14 @@
           <w:ilvl w:val="0"/>
           <w:numId w:val="4"/>
         </w:numPr>
-      </w:pPr>
-      <w:r>
+        <w:rPr>
+          <w:rFonts w:ascii="Times New Roman" w:hAnsi="Times New Roman" w:cs="Times New Roman"/>
+        </w:rPr>
+      </w:pPr>
+      <w:r>
+        <w:rPr>
+          <w:rFonts w:ascii="Times New Roman" w:hAnsi="Times New Roman" w:cs="Times New Roman"/>
+        </w:rPr>
         <w:t>Raw imported dataset</w:t>
       </w:r>
     </w:p>
@@ -1031,8 +1383,14 @@
           <w:ilvl w:val="0"/>
           <w:numId w:val="4"/>
         </w:numPr>
-      </w:pPr>
-      <w:r>
+        <w:rPr>
+          <w:rFonts w:ascii="Times New Roman" w:hAnsi="Times New Roman" w:cs="Times New Roman"/>
+        </w:rPr>
+      </w:pPr>
+      <w:r>
+        <w:rPr>
+          <w:rFonts w:ascii="Times New Roman" w:hAnsi="Times New Roman" w:cs="Times New Roman"/>
+        </w:rPr>
         <w:t>Power Query Editor</w:t>
       </w:r>
     </w:p>
@@ -1042,16 +1400,42 @@
           <w:ilvl w:val="0"/>
           <w:numId w:val="4"/>
         </w:numPr>
-      </w:pPr>
-      <w:r>
+        <w:rPr>
+          <w:rFonts w:ascii="Times New Roman" w:hAnsi="Times New Roman" w:cs="Times New Roman"/>
+        </w:rPr>
+      </w:pPr>
+      <w:r>
+        <w:rPr>
+          <w:rFonts w:ascii="Times New Roman" w:hAnsi="Times New Roman" w:cs="Times New Roman"/>
+        </w:rPr>
+        <w:t xml:space="preserve">Applied Steps </w:t>
+      </w:r>
+      <w:proofErr w:type="gramStart"/>
+      <w:r>
+        <w:rPr>
+          <w:rFonts w:ascii="Times New Roman" w:hAnsi="Times New Roman" w:cs="Times New Roman"/>
+        </w:rPr>
+        <w:t>pane</w:t>
+      </w:r>
+      <w:proofErr w:type="gramEnd"/>
+    </w:p>
+    <w:p>
+      <w:pPr>
+        <w:numPr>
+          <w:ilvl w:val="0"/>
+          <w:numId w:val="4"/>
+        </w:numPr>
+        <w:rPr>
+          <w:rFonts w:ascii="Times New Roman" w:hAnsi="Times New Roman" w:cs="Times New Roman"/>
+        </w:rPr>
+      </w:pPr>
+      <w:r>
+        <w:rPr>
+          <w:rFonts w:ascii="Times New Roman" w:hAnsi="Times New Roman" w:cs="Times New Roman"/>
+        </w:rPr>
         <w:lastRenderedPageBreak/>
-        <w:t xml:space="preserve">Applied Steps </w:t>
-      </w:r>
-      <w:proofErr w:type="gramStart"/>
-      <w:r>
-        <w:t>pane</w:t>
-      </w:r>
-      <w:proofErr w:type="gramEnd"/>
+        <w:t>Column profiling results</w:t>
+      </w:r>
     </w:p>
     <w:p>
       <w:pPr>
@@ -1059,9 +1443,15 @@
           <w:ilvl w:val="0"/>
           <w:numId w:val="4"/>
         </w:numPr>
-      </w:pPr>
-      <w:r>
-        <w:t>Column profiling results</w:t>
+        <w:rPr>
+          <w:rFonts w:ascii="Times New Roman" w:hAnsi="Times New Roman" w:cs="Times New Roman"/>
+        </w:rPr>
+      </w:pPr>
+      <w:r>
+        <w:rPr>
+          <w:rFonts w:ascii="Times New Roman" w:hAnsi="Times New Roman" w:cs="Times New Roman"/>
+        </w:rPr>
+        <w:t>Final cleaned dataset</w:t>
       </w:r>
     </w:p>
     <w:p>
@@ -1070,31 +1460,28 @@
           <w:ilvl w:val="0"/>
           <w:numId w:val="4"/>
         </w:numPr>
-      </w:pPr>
-      <w:r>
-        <w:t>Final cleaned dataset</w:t>
-      </w:r>
-    </w:p>
-    <w:p>
-      <w:pPr>
-        <w:numPr>
-          <w:ilvl w:val="0"/>
-          <w:numId w:val="4"/>
-        </w:numPr>
-      </w:pPr>
-      <w:r>
+        <w:rPr>
+          <w:rFonts w:ascii="Times New Roman" w:hAnsi="Times New Roman" w:cs="Times New Roman"/>
+        </w:rPr>
+      </w:pPr>
+      <w:r>
+        <w:rPr>
+          <w:rFonts w:ascii="Times New Roman" w:hAnsi="Times New Roman" w:cs="Times New Roman"/>
+        </w:rPr>
         <w:t>Any merge, append, pivot, unpivot, or parameter task attempted</w:t>
       </w:r>
     </w:p>
     <w:p>
       <w:pPr>
         <w:rPr>
+          <w:rFonts w:ascii="Times New Roman" w:hAnsi="Times New Roman" w:cs="Times New Roman"/>
           <w:b/>
           <w:bCs/>
         </w:rPr>
       </w:pPr>
       <w:r>
         <w:rPr>
+          <w:rFonts w:ascii="Times New Roman" w:hAnsi="Times New Roman" w:cs="Times New Roman"/>
           <w:b/>
           <w:bCs/>
         </w:rPr>
@@ -1102,19 +1489,29 @@
       </w:r>
     </w:p>
     <w:p>
-      <w:r>
+      <w:pPr>
+        <w:rPr>
+          <w:rFonts w:ascii="Times New Roman" w:hAnsi="Times New Roman" w:cs="Times New Roman"/>
+        </w:rPr>
+      </w:pPr>
+      <w:r>
+        <w:rPr>
+          <w:rFonts w:ascii="Times New Roman" w:hAnsi="Times New Roman" w:cs="Times New Roman"/>
+        </w:rPr>
         <w:t>Create a professional Power BI dashboard using the cleaned dataset.</w:t>
       </w:r>
     </w:p>
     <w:p>
       <w:pPr>
         <w:rPr>
+          <w:rFonts w:ascii="Times New Roman" w:hAnsi="Times New Roman" w:cs="Times New Roman"/>
           <w:b/>
           <w:bCs/>
         </w:rPr>
       </w:pPr>
       <w:r>
         <w:rPr>
+          <w:rFonts w:ascii="Times New Roman" w:hAnsi="Times New Roman" w:cs="Times New Roman"/>
           <w:b/>
           <w:bCs/>
         </w:rPr>
@@ -1127,8 +1524,14 @@
           <w:ilvl w:val="0"/>
           <w:numId w:val="5"/>
         </w:numPr>
-      </w:pPr>
-      <w:r>
+        <w:rPr>
+          <w:rFonts w:ascii="Times New Roman" w:hAnsi="Times New Roman" w:cs="Times New Roman"/>
+        </w:rPr>
+      </w:pPr>
+      <w:r>
+        <w:rPr>
+          <w:rFonts w:ascii="Times New Roman" w:hAnsi="Times New Roman" w:cs="Times New Roman"/>
+        </w:rPr>
         <w:t>Minimum 3 KPI cards. (3 Marks)</w:t>
       </w:r>
     </w:p>
@@ -1138,8 +1541,14 @@
           <w:ilvl w:val="0"/>
           <w:numId w:val="5"/>
         </w:numPr>
-      </w:pPr>
-      <w:r>
+        <w:rPr>
+          <w:rFonts w:ascii="Times New Roman" w:hAnsi="Times New Roman" w:cs="Times New Roman"/>
+        </w:rPr>
+      </w:pPr>
+      <w:r>
+        <w:rPr>
+          <w:rFonts w:ascii="Times New Roman" w:hAnsi="Times New Roman" w:cs="Times New Roman"/>
+        </w:rPr>
         <w:t>Bar chart. (3 Marks)</w:t>
       </w:r>
     </w:p>
@@ -1149,8 +1558,14 @@
           <w:ilvl w:val="0"/>
           <w:numId w:val="5"/>
         </w:numPr>
-      </w:pPr>
-      <w:r>
+        <w:rPr>
+          <w:rFonts w:ascii="Times New Roman" w:hAnsi="Times New Roman" w:cs="Times New Roman"/>
+        </w:rPr>
+      </w:pPr>
+      <w:r>
+        <w:rPr>
+          <w:rFonts w:ascii="Times New Roman" w:hAnsi="Times New Roman" w:cs="Times New Roman"/>
+        </w:rPr>
         <w:t>Column chart. (3 Marks)</w:t>
       </w:r>
     </w:p>
@@ -1160,8 +1575,14 @@
           <w:ilvl w:val="0"/>
           <w:numId w:val="5"/>
         </w:numPr>
-      </w:pPr>
-      <w:r>
+        <w:rPr>
+          <w:rFonts w:ascii="Times New Roman" w:hAnsi="Times New Roman" w:cs="Times New Roman"/>
+        </w:rPr>
+      </w:pPr>
+      <w:r>
+        <w:rPr>
+          <w:rFonts w:ascii="Times New Roman" w:hAnsi="Times New Roman" w:cs="Times New Roman"/>
+        </w:rPr>
         <w:t>Line chart showing a trend. (3 Marks)</w:t>
       </w:r>
     </w:p>
@@ -1171,8 +1592,14 @@
           <w:ilvl w:val="0"/>
           <w:numId w:val="5"/>
         </w:numPr>
-      </w:pPr>
-      <w:r>
+        <w:rPr>
+          <w:rFonts w:ascii="Times New Roman" w:hAnsi="Times New Roman" w:cs="Times New Roman"/>
+        </w:rPr>
+      </w:pPr>
+      <w:r>
+        <w:rPr>
+          <w:rFonts w:ascii="Times New Roman" w:hAnsi="Times New Roman" w:cs="Times New Roman"/>
+        </w:rPr>
         <w:t>Pie or donut chart. (3 Marks)</w:t>
       </w:r>
     </w:p>
@@ -1182,8 +1609,14 @@
           <w:ilvl w:val="0"/>
           <w:numId w:val="5"/>
         </w:numPr>
-      </w:pPr>
-      <w:r>
+        <w:rPr>
+          <w:rFonts w:ascii="Times New Roman" w:hAnsi="Times New Roman" w:cs="Times New Roman"/>
+        </w:rPr>
+      </w:pPr>
+      <w:r>
+        <w:rPr>
+          <w:rFonts w:ascii="Times New Roman" w:hAnsi="Times New Roman" w:cs="Times New Roman"/>
+        </w:rPr>
         <w:t>Table visual. (3 Marks)</w:t>
       </w:r>
     </w:p>
@@ -1193,8 +1626,14 @@
           <w:ilvl w:val="0"/>
           <w:numId w:val="5"/>
         </w:numPr>
-      </w:pPr>
-      <w:r>
+        <w:rPr>
+          <w:rFonts w:ascii="Times New Roman" w:hAnsi="Times New Roman" w:cs="Times New Roman"/>
+        </w:rPr>
+      </w:pPr>
+      <w:r>
+        <w:rPr>
+          <w:rFonts w:ascii="Times New Roman" w:hAnsi="Times New Roman" w:cs="Times New Roman"/>
+        </w:rPr>
         <w:t>Matrix visual. (3 Marks)</w:t>
       </w:r>
     </w:p>
@@ -1204,8 +1643,14 @@
           <w:ilvl w:val="0"/>
           <w:numId w:val="5"/>
         </w:numPr>
-      </w:pPr>
-      <w:r>
+        <w:rPr>
+          <w:rFonts w:ascii="Times New Roman" w:hAnsi="Times New Roman" w:cs="Times New Roman"/>
+        </w:rPr>
+      </w:pPr>
+      <w:r>
+        <w:rPr>
+          <w:rFonts w:ascii="Times New Roman" w:hAnsi="Times New Roman" w:cs="Times New Roman"/>
+        </w:rPr>
         <w:t>Map or filled map, where applicable. (3 Marks)</w:t>
       </w:r>
     </w:p>
@@ -1215,8 +1660,14 @@
           <w:ilvl w:val="0"/>
           <w:numId w:val="5"/>
         </w:numPr>
-      </w:pPr>
-      <w:r>
+        <w:rPr>
+          <w:rFonts w:ascii="Times New Roman" w:hAnsi="Times New Roman" w:cs="Times New Roman"/>
+        </w:rPr>
+      </w:pPr>
+      <w:r>
+        <w:rPr>
+          <w:rFonts w:ascii="Times New Roman" w:hAnsi="Times New Roman" w:cs="Times New Roman"/>
+        </w:rPr>
         <w:t>Any two additional meaningful visuals. (4 Marks)</w:t>
       </w:r>
     </w:p>
@@ -1226,20 +1677,123 @@
           <w:ilvl w:val="0"/>
           <w:numId w:val="5"/>
         </w:numPr>
-      </w:pPr>
-      <w:r>
+        <w:rPr>
+          <w:rFonts w:ascii="Times New Roman" w:hAnsi="Times New Roman" w:cs="Times New Roman"/>
+        </w:rPr>
+      </w:pPr>
+      <w:r>
+        <w:rPr>
+          <w:rFonts w:ascii="Times New Roman" w:hAnsi="Times New Roman" w:cs="Times New Roman"/>
+        </w:rPr>
         <w:t>Professional layout, titles, formatting, and readability. (2 Marks)</w:t>
       </w:r>
     </w:p>
     <w:p>
       <w:pPr>
         <w:rPr>
+          <w:rFonts w:ascii="Times New Roman" w:hAnsi="Times New Roman" w:cs="Times New Roman"/>
+        </w:rPr>
+      </w:pPr>
+      <w:r>
+        <w:rPr>
+          <w:rFonts w:ascii="Times New Roman" w:hAnsi="Times New Roman" w:cs="Times New Roman"/>
+        </w:rPr>
+        <w:lastRenderedPageBreak/>
+        <w:drawing>
+          <wp:inline distT="0" distB="0" distL="0" distR="0" wp14:anchorId="71098A61" wp14:editId="3DDD4880">
+            <wp:extent cx="5943600" cy="3371850"/>
+            <wp:effectExtent l="0" t="0" r="0" b="0"/>
+            <wp:docPr id="1583980620" name="Picture 1"/>
+            <wp:cNvGraphicFramePr>
+              <a:graphicFrameLocks xmlns:a="http://schemas.openxmlformats.org/drawingml/2006/main" noChangeAspect="1"/>
+            </wp:cNvGraphicFramePr>
+            <a:graphic xmlns:a="http://schemas.openxmlformats.org/drawingml/2006/main">
+              <a:graphicData uri="http://schemas.openxmlformats.org/drawingml/2006/picture">
+                <pic:pic xmlns:pic="http://schemas.openxmlformats.org/drawingml/2006/picture">
+                  <pic:nvPicPr>
+                    <pic:cNvPr id="1583980620" name=""/>
+                    <pic:cNvPicPr/>
+                  </pic:nvPicPr>
+                  <pic:blipFill>
+                    <a:blip r:embed="rId20"/>
+                    <a:stretch>
+                      <a:fillRect/>
+                    </a:stretch>
+                  </pic:blipFill>
+                  <pic:spPr>
+                    <a:xfrm>
+                      <a:off x="0" y="0"/>
+                      <a:ext cx="5943600" cy="3371850"/>
+                    </a:xfrm>
+                    <a:prstGeom prst="rect">
+                      <a:avLst/>
+                    </a:prstGeom>
+                  </pic:spPr>
+                </pic:pic>
+              </a:graphicData>
+            </a:graphic>
+          </wp:inline>
+        </w:drawing>
+      </w:r>
+    </w:p>
+    <w:p>
+      <w:pPr>
+        <w:rPr>
+          <w:rFonts w:ascii="Times New Roman" w:hAnsi="Times New Roman" w:cs="Times New Roman"/>
+        </w:rPr>
+      </w:pPr>
+      <w:r>
+        <w:rPr>
+          <w:rFonts w:ascii="Times New Roman" w:hAnsi="Times New Roman" w:cs="Times New Roman"/>
+        </w:rPr>
+        <w:drawing>
+          <wp:inline distT="0" distB="0" distL="0" distR="0" wp14:anchorId="4C208D5E" wp14:editId="49BE076A">
+            <wp:extent cx="5943600" cy="3465195"/>
+            <wp:effectExtent l="0" t="0" r="0" b="1905"/>
+            <wp:docPr id="871852521" name="Picture 1"/>
+            <wp:cNvGraphicFramePr>
+              <a:graphicFrameLocks xmlns:a="http://schemas.openxmlformats.org/drawingml/2006/main" noChangeAspect="1"/>
+            </wp:cNvGraphicFramePr>
+            <a:graphic xmlns:a="http://schemas.openxmlformats.org/drawingml/2006/main">
+              <a:graphicData uri="http://schemas.openxmlformats.org/drawingml/2006/picture">
+                <pic:pic xmlns:pic="http://schemas.openxmlformats.org/drawingml/2006/picture">
+                  <pic:nvPicPr>
+                    <pic:cNvPr id="871852521" name=""/>
+                    <pic:cNvPicPr/>
+                  </pic:nvPicPr>
+                  <pic:blipFill>
+                    <a:blip r:embed="rId21"/>
+                    <a:stretch>
+                      <a:fillRect/>
+                    </a:stretch>
+                  </pic:blipFill>
+                  <pic:spPr>
+                    <a:xfrm>
+                      <a:off x="0" y="0"/>
+                      <a:ext cx="5943600" cy="3465195"/>
+                    </a:xfrm>
+                    <a:prstGeom prst="rect">
+                      <a:avLst/>
+                    </a:prstGeom>
+                  </pic:spPr>
+                </pic:pic>
+              </a:graphicData>
+            </a:graphic>
+          </wp:inline>
+        </w:drawing>
+      </w:r>
+    </w:p>
+    <w:p>
+      <w:pPr>
+        <w:rPr>
+          <w:rFonts w:ascii="Times New Roman" w:hAnsi="Times New Roman" w:cs="Times New Roman"/>
           <w:b/>
           <w:bCs/>
         </w:rPr>
       </w:pPr>
       <w:r>
         <w:rPr>
+          <w:rFonts w:ascii="Times New Roman" w:hAnsi="Times New Roman" w:cs="Times New Roman"/>
           <w:b/>
           <w:bCs/>
         </w:rPr>
@@ -1252,31 +1806,221 @@
           <w:ilvl w:val="0"/>
           <w:numId w:val="6"/>
         </w:numPr>
-      </w:pPr>
-      <w:r>
+        <w:rPr>
+          <w:rFonts w:ascii="Times New Roman" w:hAnsi="Times New Roman" w:cs="Times New Roman"/>
+        </w:rPr>
+      </w:pPr>
+      <w:r>
+        <w:rPr>
+          <w:rFonts w:ascii="Times New Roman" w:hAnsi="Times New Roman" w:cs="Times New Roman"/>
+        </w:rPr>
         <w:t>Add at least three slicers. (3 Marks)</w:t>
       </w:r>
     </w:p>
     <w:p>
       <w:pPr>
+        <w:rPr>
+          <w:rFonts w:ascii="Times New Roman" w:hAnsi="Times New Roman" w:cs="Times New Roman"/>
+        </w:rPr>
+      </w:pPr>
+      <w:r>
+        <w:rPr>
+          <w:rFonts w:ascii="Times New Roman" w:hAnsi="Times New Roman" w:cs="Times New Roman"/>
+        </w:rPr>
+        <w:lastRenderedPageBreak/>
+        <w:drawing>
+          <wp:inline distT="0" distB="0" distL="0" distR="0" wp14:anchorId="361333BD" wp14:editId="19B49F6C">
+            <wp:extent cx="5391902" cy="5649113"/>
+            <wp:effectExtent l="0" t="0" r="0" b="8890"/>
+            <wp:docPr id="1439734786" name="Picture 1"/>
+            <wp:cNvGraphicFramePr>
+              <a:graphicFrameLocks xmlns:a="http://schemas.openxmlformats.org/drawingml/2006/main" noChangeAspect="1"/>
+            </wp:cNvGraphicFramePr>
+            <a:graphic xmlns:a="http://schemas.openxmlformats.org/drawingml/2006/main">
+              <a:graphicData uri="http://schemas.openxmlformats.org/drawingml/2006/picture">
+                <pic:pic xmlns:pic="http://schemas.openxmlformats.org/drawingml/2006/picture">
+                  <pic:nvPicPr>
+                    <pic:cNvPr id="1439734786" name=""/>
+                    <pic:cNvPicPr/>
+                  </pic:nvPicPr>
+                  <pic:blipFill>
+                    <a:blip r:embed="rId22"/>
+                    <a:stretch>
+                      <a:fillRect/>
+                    </a:stretch>
+                  </pic:blipFill>
+                  <pic:spPr>
+                    <a:xfrm>
+                      <a:off x="0" y="0"/>
+                      <a:ext cx="5391902" cy="5649113"/>
+                    </a:xfrm>
+                    <a:prstGeom prst="rect">
+                      <a:avLst/>
+                    </a:prstGeom>
+                  </pic:spPr>
+                </pic:pic>
+              </a:graphicData>
+            </a:graphic>
+          </wp:inline>
+        </w:drawing>
+      </w:r>
+    </w:p>
+    <w:p>
+      <w:pPr>
         <w:numPr>
           <w:ilvl w:val="0"/>
           <w:numId w:val="6"/>
         </w:numPr>
-      </w:pPr>
-      <w:r>
+        <w:rPr>
+          <w:rFonts w:ascii="Times New Roman" w:hAnsi="Times New Roman" w:cs="Times New Roman"/>
+        </w:rPr>
+      </w:pPr>
+      <w:r>
+        <w:rPr>
+          <w:rFonts w:ascii="Times New Roman" w:hAnsi="Times New Roman" w:cs="Times New Roman"/>
+        </w:rPr>
         <w:t>Enable drill-down on one visual. (2 Marks)</w:t>
       </w:r>
     </w:p>
     <w:p>
       <w:pPr>
+        <w:ind w:left="360"/>
+        <w:rPr>
+          <w:rFonts w:ascii="Times New Roman" w:hAnsi="Times New Roman" w:cs="Times New Roman"/>
+        </w:rPr>
+      </w:pPr>
+      <w:r>
+        <w:rPr>
+          <w:rFonts w:ascii="Times New Roman" w:hAnsi="Times New Roman" w:cs="Times New Roman"/>
+        </w:rPr>
+        <w:drawing>
+          <wp:inline distT="0" distB="0" distL="0" distR="0" wp14:anchorId="2C3AB11D" wp14:editId="53A0AB42">
+            <wp:extent cx="5943600" cy="2054225"/>
+            <wp:effectExtent l="0" t="0" r="0" b="3175"/>
+            <wp:docPr id="1470157575" name="Picture 1"/>
+            <wp:cNvGraphicFramePr>
+              <a:graphicFrameLocks xmlns:a="http://schemas.openxmlformats.org/drawingml/2006/main" noChangeAspect="1"/>
+            </wp:cNvGraphicFramePr>
+            <a:graphic xmlns:a="http://schemas.openxmlformats.org/drawingml/2006/main">
+              <a:graphicData uri="http://schemas.openxmlformats.org/drawingml/2006/picture">
+                <pic:pic xmlns:pic="http://schemas.openxmlformats.org/drawingml/2006/picture">
+                  <pic:nvPicPr>
+                    <pic:cNvPr id="1470157575" name=""/>
+                    <pic:cNvPicPr/>
+                  </pic:nvPicPr>
+                  <pic:blipFill>
+                    <a:blip r:embed="rId23"/>
+                    <a:stretch>
+                      <a:fillRect/>
+                    </a:stretch>
+                  </pic:blipFill>
+                  <pic:spPr>
+                    <a:xfrm>
+                      <a:off x="0" y="0"/>
+                      <a:ext cx="5943600" cy="2054225"/>
+                    </a:xfrm>
+                    <a:prstGeom prst="rect">
+                      <a:avLst/>
+                    </a:prstGeom>
+                  </pic:spPr>
+                </pic:pic>
+              </a:graphicData>
+            </a:graphic>
+          </wp:inline>
+        </w:drawing>
+      </w:r>
+    </w:p>
+    <w:p>
+      <w:pPr>
         <w:numPr>
           <w:ilvl w:val="0"/>
           <w:numId w:val="6"/>
         </w:numPr>
-      </w:pPr>
-      <w:r>
-        <w:t>Demonstrate cross-filtering between visuals. (2 Marks)</w:t>
+        <w:rPr>
+          <w:rFonts w:ascii="Times New Roman" w:hAnsi="Times New Roman" w:cs="Times New Roman"/>
+        </w:rPr>
+      </w:pPr>
+      <w:r>
+        <w:rPr>
+          <w:rFonts w:ascii="Times New Roman" w:hAnsi="Times New Roman" w:cs="Times New Roman"/>
+        </w:rPr>
+        <w:lastRenderedPageBreak/>
+        <w:t>Demonstrate cross-filtering between visuals. (2 Marks</w:t>
+      </w:r>
+      <w:proofErr w:type="gramStart"/>
+      <w:r>
+        <w:rPr>
+          <w:rFonts w:ascii="Times New Roman" w:hAnsi="Times New Roman" w:cs="Times New Roman"/>
+        </w:rPr>
+        <w:t>)</w:t>
+      </w:r>
+      <w:r>
+        <w:rPr>
+          <w:rFonts w:ascii="Times New Roman" w:hAnsi="Times New Roman" w:cs="Times New Roman"/>
+        </w:rPr>
+        <w:t>:</w:t>
+      </w:r>
+      <w:proofErr w:type="spellStart"/>
+      <w:r>
+        <w:rPr>
+          <w:rFonts w:ascii="Times New Roman" w:hAnsi="Times New Roman" w:cs="Times New Roman"/>
+        </w:rPr>
+        <w:t>whe</w:t>
+      </w:r>
+      <w:proofErr w:type="spellEnd"/>
+      <w:proofErr w:type="gramEnd"/>
+      <w:r>
+        <w:rPr>
+          <w:rFonts w:ascii="Times New Roman" w:hAnsi="Times New Roman" w:cs="Times New Roman"/>
+        </w:rPr>
+        <w:t xml:space="preserve"> the surface is selected </w:t>
+      </w:r>
+    </w:p>
+    <w:p>
+      <w:pPr>
+        <w:rPr>
+          <w:rFonts w:ascii="Times New Roman" w:hAnsi="Times New Roman" w:cs="Times New Roman"/>
+        </w:rPr>
+      </w:pPr>
+      <w:r>
+        <w:rPr>
+          <w:rFonts w:ascii="Times New Roman" w:hAnsi="Times New Roman" w:cs="Times New Roman"/>
+        </w:rPr>
+        <w:drawing>
+          <wp:inline distT="0" distB="0" distL="0" distR="0" wp14:anchorId="70821810" wp14:editId="74AC5A05">
+            <wp:extent cx="5943600" cy="3362960"/>
+            <wp:effectExtent l="0" t="0" r="0" b="8890"/>
+            <wp:docPr id="1522987884" name="Picture 1"/>
+            <wp:cNvGraphicFramePr>
+              <a:graphicFrameLocks xmlns:a="http://schemas.openxmlformats.org/drawingml/2006/main" noChangeAspect="1"/>
+            </wp:cNvGraphicFramePr>
+            <a:graphic xmlns:a="http://schemas.openxmlformats.org/drawingml/2006/main">
+              <a:graphicData uri="http://schemas.openxmlformats.org/drawingml/2006/picture">
+                <pic:pic xmlns:pic="http://schemas.openxmlformats.org/drawingml/2006/picture">
+                  <pic:nvPicPr>
+                    <pic:cNvPr id="1522987884" name=""/>
+                    <pic:cNvPicPr/>
+                  </pic:nvPicPr>
+                  <pic:blipFill>
+                    <a:blip r:embed="rId24"/>
+                    <a:stretch>
+                      <a:fillRect/>
+                    </a:stretch>
+                  </pic:blipFill>
+                  <pic:spPr>
+                    <a:xfrm>
+                      <a:off x="0" y="0"/>
+                      <a:ext cx="5943600" cy="3362960"/>
+                    </a:xfrm>
+                    <a:prstGeom prst="rect">
+                      <a:avLst/>
+                    </a:prstGeom>
+                  </pic:spPr>
+                </pic:pic>
+              </a:graphicData>
+            </a:graphic>
+          </wp:inline>
+        </w:drawing>
       </w:r>
     </w:p>
     <w:p>
@@ -1285,12 +2029,425 @@
           <w:ilvl w:val="0"/>
           <w:numId w:val="6"/>
         </w:numPr>
-      </w:pPr>
-      <w:r>
+        <w:rPr>
+          <w:rFonts w:ascii="Times New Roman" w:hAnsi="Times New Roman" w:cs="Times New Roman"/>
+        </w:rPr>
+      </w:pPr>
+      <w:r>
+        <w:rPr>
+          <w:rFonts w:ascii="Times New Roman" w:hAnsi="Times New Roman" w:cs="Times New Roman"/>
+        </w:rPr>
         <w:t>Write three business insights based on the dashboard. (3 Marks)</w:t>
       </w:r>
     </w:p>
-    <w:p/>
+    <w:p>
+      <w:pPr>
+        <w:rPr>
+          <w:rFonts w:ascii="Times New Roman" w:hAnsi="Times New Roman" w:cs="Times New Roman"/>
+        </w:rPr>
+      </w:pPr>
+    </w:p>
+    <w:p>
+      <w:pPr>
+        <w:rPr>
+          <w:rFonts w:ascii="Times New Roman" w:hAnsi="Times New Roman" w:cs="Times New Roman"/>
+        </w:rPr>
+      </w:pPr>
+      <w:r>
+        <w:rPr>
+          <w:rFonts w:ascii="Times New Roman" w:eastAsia="Times New Roman" w:hAnsi="Times New Roman" w:cs="Times New Roman"/>
+          <w:b/>
+          <w:bCs/>
+          <w:kern w:val="0"/>
+          <w14:ligatures w14:val="none"/>
+        </w:rPr>
+        <w:t>Depth-Temperature Relationship</w:t>
+      </w:r>
+    </w:p>
+    <w:p>
+      <w:pPr>
+        <w:spacing w:before="100" w:beforeAutospacing="1" w:after="100" w:afterAutospacing="1" w:line="240" w:lineRule="auto"/>
+        <w:rPr>
+          <w:rFonts w:ascii="Times New Roman" w:eastAsia="Times New Roman" w:hAnsi="Times New Roman" w:cs="Times New Roman"/>
+          <w:kern w:val="0"/>
+          <w14:ligatures w14:val="none"/>
+        </w:rPr>
+      </w:pPr>
+      <w:r>
+        <w:rPr>
+          <w:rFonts w:ascii="Times New Roman" w:eastAsia="Times New Roman" w:hAnsi="Times New Roman" w:cs="Times New Roman"/>
+          <w:b/>
+          <w:bCs/>
+          <w:kern w:val="0"/>
+          <w14:ligatures w14:val="none"/>
+        </w:rPr>
+        <w:t>Observation:</w:t>
+      </w:r>
+      <w:r>
+        <w:rPr>
+          <w:rFonts w:ascii="Times New Roman" w:eastAsia="Times New Roman" w:hAnsi="Times New Roman" w:cs="Times New Roman"/>
+          <w:kern w:val="0"/>
+          <w14:ligatures w14:val="none"/>
+        </w:rPr>
+        <w:t xml:space="preserve"> Average water temperature decreases significantly </w:t>
+      </w:r>
+      <w:proofErr w:type="gramStart"/>
+      <w:r>
+        <w:rPr>
+          <w:rFonts w:ascii="Times New Roman" w:eastAsia="Times New Roman" w:hAnsi="Times New Roman" w:cs="Times New Roman"/>
+          <w:kern w:val="0"/>
+          <w14:ligatures w14:val="none"/>
+        </w:rPr>
+        <w:t>with</w:t>
+      </w:r>
+      <w:proofErr w:type="gramEnd"/>
+      <w:r>
+        <w:rPr>
+          <w:rFonts w:ascii="Times New Roman" w:eastAsia="Times New Roman" w:hAnsi="Times New Roman" w:cs="Times New Roman"/>
+          <w:kern w:val="0"/>
+          <w14:ligatures w14:val="none"/>
+        </w:rPr>
+        <w:t xml:space="preserve"> depth, dropping from ~10°C at the surface to ~4-5°C at depths exceeding 800m.</w:t>
+      </w:r>
+    </w:p>
+    <w:p>
+      <w:pPr>
+        <w:spacing w:before="100" w:beforeAutospacing="1" w:after="100" w:afterAutospacing="1" w:line="240" w:lineRule="auto"/>
+        <w:rPr>
+          <w:rFonts w:ascii="Times New Roman" w:eastAsia="Times New Roman" w:hAnsi="Times New Roman" w:cs="Times New Roman"/>
+          <w:kern w:val="0"/>
+          <w14:ligatures w14:val="none"/>
+        </w:rPr>
+      </w:pPr>
+      <w:r>
+        <w:rPr>
+          <w:rFonts w:ascii="Times New Roman" w:eastAsia="Times New Roman" w:hAnsi="Times New Roman" w:cs="Times New Roman"/>
+          <w:b/>
+          <w:bCs/>
+          <w:kern w:val="0"/>
+          <w14:ligatures w14:val="none"/>
+        </w:rPr>
+        <w:t>Business implication:</w:t>
+      </w:r>
+      <w:r>
+        <w:rPr>
+          <w:rFonts w:ascii="Times New Roman" w:eastAsia="Times New Roman" w:hAnsi="Times New Roman" w:cs="Times New Roman"/>
+          <w:kern w:val="0"/>
+          <w14:ligatures w14:val="none"/>
+        </w:rPr>
+        <w:t xml:space="preserve"> This strong inverse relationship suggests different water masses at different depths. Surface waters are warmer (likely influenced by seasonal solar heating), while deep </w:t>
+      </w:r>
+      <w:proofErr w:type="gramStart"/>
+      <w:r>
+        <w:rPr>
+          <w:rFonts w:ascii="Times New Roman" w:eastAsia="Times New Roman" w:hAnsi="Times New Roman" w:cs="Times New Roman"/>
+          <w:kern w:val="0"/>
+          <w14:ligatures w14:val="none"/>
+        </w:rPr>
+        <w:t>waters</w:t>
+      </w:r>
+      <w:proofErr w:type="gramEnd"/>
+      <w:r>
+        <w:rPr>
+          <w:rFonts w:ascii="Times New Roman" w:eastAsia="Times New Roman" w:hAnsi="Times New Roman" w:cs="Times New Roman"/>
+          <w:kern w:val="0"/>
+          <w14:ligatures w14:val="none"/>
+        </w:rPr>
+        <w:t xml:space="preserve"> remain consistently cold. This pattern is critical for marine ecosystem management and fisheries planning, as different species prefer different temperature zones.</w:t>
+      </w:r>
+    </w:p>
+    <w:p>
+      <w:pPr>
+        <w:spacing w:before="100" w:beforeAutospacing="1" w:after="100" w:afterAutospacing="1" w:line="240" w:lineRule="auto"/>
+        <w:rPr>
+          <w:rFonts w:ascii="Times New Roman" w:eastAsia="Times New Roman" w:hAnsi="Times New Roman" w:cs="Times New Roman"/>
+          <w:kern w:val="0"/>
+          <w14:ligatures w14:val="none"/>
+        </w:rPr>
+      </w:pPr>
+      <w:r>
+        <w:rPr>
+          <w:rFonts w:ascii="Times New Roman" w:eastAsia="Times New Roman" w:hAnsi="Times New Roman" w:cs="Times New Roman"/>
+          <w:b/>
+          <w:bCs/>
+          <w:kern w:val="0"/>
+          <w14:ligatures w14:val="none"/>
+        </w:rPr>
+        <w:t>Recommendation:</w:t>
+      </w:r>
+      <w:r>
+        <w:rPr>
+          <w:rFonts w:ascii="Times New Roman" w:eastAsia="Times New Roman" w:hAnsi="Times New Roman" w:cs="Times New Roman"/>
+          <w:kern w:val="0"/>
+          <w14:ligatures w14:val="none"/>
+        </w:rPr>
+        <w:t xml:space="preserve"> Monitor seasonal variations in the thermocline (transition zone). Focus conservation efforts on species-specific thermal habitats.</w:t>
+      </w:r>
+    </w:p>
+    <w:p>
+      <w:pPr>
+        <w:spacing w:before="100" w:beforeAutospacing="1" w:after="100" w:afterAutospacing="1" w:line="240" w:lineRule="auto"/>
+        <w:rPr>
+          <w:rFonts w:ascii="Times New Roman" w:eastAsia="Times New Roman" w:hAnsi="Times New Roman" w:cs="Times New Roman"/>
+          <w:kern w:val="0"/>
+          <w14:ligatures w14:val="none"/>
+        </w:rPr>
+      </w:pPr>
+      <w:r>
+        <w:rPr>
+          <w:rFonts w:ascii="Times New Roman" w:eastAsia="Times New Roman" w:hAnsi="Times New Roman" w:cs="Times New Roman"/>
+          <w:b/>
+          <w:bCs/>
+          <w:kern w:val="0"/>
+          <w14:ligatures w14:val="none"/>
+        </w:rPr>
+        <w:t>Station-to-Station Oxygen Variation</w:t>
+      </w:r>
+    </w:p>
+    <w:p>
+      <w:pPr>
+        <w:spacing w:before="100" w:beforeAutospacing="1" w:after="100" w:afterAutospacing="1" w:line="240" w:lineRule="auto"/>
+        <w:rPr>
+          <w:rFonts w:ascii="Times New Roman" w:eastAsia="Times New Roman" w:hAnsi="Times New Roman" w:cs="Times New Roman"/>
+          <w:kern w:val="0"/>
+          <w14:ligatures w14:val="none"/>
+        </w:rPr>
+      </w:pPr>
+      <w:r>
+        <w:rPr>
+          <w:rFonts w:ascii="Times New Roman" w:eastAsia="Times New Roman" w:hAnsi="Times New Roman" w:cs="Times New Roman"/>
+          <w:b/>
+          <w:bCs/>
+          <w:kern w:val="0"/>
+          <w14:ligatures w14:val="none"/>
+        </w:rPr>
+        <w:t>Observation:</w:t>
+      </w:r>
+      <w:r>
+        <w:rPr>
+          <w:rFonts w:ascii="Times New Roman" w:eastAsia="Times New Roman" w:hAnsi="Times New Roman" w:cs="Times New Roman"/>
+          <w:kern w:val="0"/>
+          <w14:ligatures w14:val="none"/>
+        </w:rPr>
+        <w:t xml:space="preserve"> Dissolved oxygen levels vary significantly across sampling stations, ranging from 3.2 ml/L to 7.8 ml/L. Stations in coastal areas show consistently lower oxygen than offshore stations.</w:t>
+      </w:r>
+    </w:p>
+    <w:p>
+      <w:pPr>
+        <w:spacing w:before="100" w:beforeAutospacing="1" w:after="100" w:afterAutospacing="1" w:line="240" w:lineRule="auto"/>
+        <w:rPr>
+          <w:rFonts w:ascii="Times New Roman" w:eastAsia="Times New Roman" w:hAnsi="Times New Roman" w:cs="Times New Roman"/>
+          <w:kern w:val="0"/>
+          <w14:ligatures w14:val="none"/>
+        </w:rPr>
+      </w:pPr>
+      <w:r>
+        <w:rPr>
+          <w:rFonts w:ascii="Times New Roman" w:eastAsia="Times New Roman" w:hAnsi="Times New Roman" w:cs="Times New Roman"/>
+          <w:b/>
+          <w:bCs/>
+          <w:kern w:val="0"/>
+          <w14:ligatures w14:val="none"/>
+        </w:rPr>
+        <w:lastRenderedPageBreak/>
+        <w:t>Business implication:</w:t>
+      </w:r>
+      <w:r>
+        <w:rPr>
+          <w:rFonts w:ascii="Times New Roman" w:eastAsia="Times New Roman" w:hAnsi="Times New Roman" w:cs="Times New Roman"/>
+          <w:kern w:val="0"/>
+          <w14:ligatures w14:val="none"/>
+        </w:rPr>
+        <w:t xml:space="preserve"> Low oxygen zones (hypoxic areas) may indicate poor water circulation, high organic matter decomposition, or eutrophication. These are concerning for marine life. Coastal stations showing low O₂ warrant urgent environmental monitoring.</w:t>
+      </w:r>
+    </w:p>
+    <w:p>
+      <w:pPr>
+        <w:spacing w:before="100" w:beforeAutospacing="1" w:after="100" w:afterAutospacing="1" w:line="240" w:lineRule="auto"/>
+        <w:rPr>
+          <w:rFonts w:ascii="Times New Roman" w:eastAsia="Times New Roman" w:hAnsi="Times New Roman" w:cs="Times New Roman"/>
+          <w:kern w:val="0"/>
+          <w14:ligatures w14:val="none"/>
+        </w:rPr>
+      </w:pPr>
+      <w:r>
+        <w:rPr>
+          <w:rFonts w:ascii="Times New Roman" w:eastAsia="Times New Roman" w:hAnsi="Times New Roman" w:cs="Times New Roman"/>
+          <w:b/>
+          <w:bCs/>
+          <w:kern w:val="0"/>
+          <w14:ligatures w14:val="none"/>
+        </w:rPr>
+        <w:t>Recommendation:</w:t>
+      </w:r>
+      <w:r>
+        <w:rPr>
+          <w:rFonts w:ascii="Times New Roman" w:eastAsia="Times New Roman" w:hAnsi="Times New Roman" w:cs="Times New Roman"/>
+          <w:kern w:val="0"/>
+          <w14:ligatures w14:val="none"/>
+        </w:rPr>
+        <w:t xml:space="preserve"> Investigate pollution sources near low-O₂ stations. Consider remediation measures (e.g., improved water circulation, sediment management). Schedule increased monitoring frequency in hypoxic zones.</w:t>
+      </w:r>
+    </w:p>
+    <w:p>
+      <w:pPr>
+        <w:spacing w:after="0" w:line="240" w:lineRule="auto"/>
+        <w:rPr>
+          <w:rFonts w:ascii="Times New Roman" w:eastAsia="Times New Roman" w:hAnsi="Times New Roman" w:cs="Times New Roman"/>
+          <w:kern w:val="0"/>
+          <w14:ligatures w14:val="none"/>
+        </w:rPr>
+      </w:pPr>
+      <w:r>
+        <w:rPr>
+          <w:rFonts w:ascii="Times New Roman" w:eastAsia="Times New Roman" w:hAnsi="Times New Roman" w:cs="Times New Roman"/>
+          <w:kern w:val="0"/>
+          <w14:ligatures w14:val="none"/>
+        </w:rPr>
+        <w:pict w14:anchorId="2CE90946">
+          <v:rect id="_x0000_i1074" style="width:0;height:1.5pt" o:hralign="center" o:hrstd="t" o:hr="t" fillcolor="#a0a0a0" stroked="f"/>
+        </w:pict>
+      </w:r>
+    </w:p>
+    <w:p>
+      <w:pPr>
+        <w:spacing w:before="100" w:beforeAutospacing="1" w:after="100" w:afterAutospacing="1" w:line="240" w:lineRule="auto"/>
+        <w:outlineLvl w:val="2"/>
+        <w:rPr>
+          <w:rFonts w:ascii="Times New Roman" w:eastAsia="Times New Roman" w:hAnsi="Times New Roman" w:cs="Times New Roman"/>
+          <w:b/>
+          <w:bCs/>
+          <w:kern w:val="0"/>
+          <w14:ligatures w14:val="none"/>
+        </w:rPr>
+      </w:pPr>
+      <w:r>
+        <w:rPr>
+          <w:rFonts w:ascii="Times New Roman" w:eastAsia="Times New Roman" w:hAnsi="Times New Roman" w:cs="Times New Roman"/>
+          <w:b/>
+          <w:bCs/>
+          <w:kern w:val="0"/>
+          <w14:ligatures w14:val="none"/>
+        </w:rPr>
+        <w:t>Insight 3: Data Quality Assessment</w:t>
+      </w:r>
+    </w:p>
+    <w:p>
+      <w:pPr>
+        <w:spacing w:before="100" w:beforeAutospacing="1" w:after="100" w:afterAutospacing="1" w:line="240" w:lineRule="auto"/>
+        <w:rPr>
+          <w:rFonts w:ascii="Times New Roman" w:eastAsia="Times New Roman" w:hAnsi="Times New Roman" w:cs="Times New Roman"/>
+          <w:kern w:val="0"/>
+          <w14:ligatures w14:val="none"/>
+        </w:rPr>
+      </w:pPr>
+      <w:r>
+        <w:rPr>
+          <w:rFonts w:ascii="Times New Roman" w:eastAsia="Times New Roman" w:hAnsi="Times New Roman" w:cs="Times New Roman"/>
+          <w:b/>
+          <w:bCs/>
+          <w:kern w:val="0"/>
+          <w14:ligatures w14:val="none"/>
+        </w:rPr>
+        <w:t>Observation:</w:t>
+      </w:r>
+      <w:r>
+        <w:rPr>
+          <w:rFonts w:ascii="Times New Roman" w:eastAsia="Times New Roman" w:hAnsi="Times New Roman" w:cs="Times New Roman"/>
+          <w:kern w:val="0"/>
+          <w14:ligatures w14:val="none"/>
+        </w:rPr>
+        <w:t xml:space="preserve"> Temperature measurements have 98% data completeness (valid readings), while some nutrient measurements have only 35% coverage. Quality codes indicate 12% of records have flagged measurement uncertainties.</w:t>
+      </w:r>
+    </w:p>
+    <w:p>
+      <w:pPr>
+        <w:spacing w:before="100" w:beforeAutospacing="1" w:after="100" w:afterAutospacing="1" w:line="240" w:lineRule="auto"/>
+        <w:rPr>
+          <w:rFonts w:ascii="Times New Roman" w:eastAsia="Times New Roman" w:hAnsi="Times New Roman" w:cs="Times New Roman"/>
+          <w:kern w:val="0"/>
+          <w14:ligatures w14:val="none"/>
+        </w:rPr>
+      </w:pPr>
+      <w:r>
+        <w:rPr>
+          <w:rFonts w:ascii="Times New Roman" w:eastAsia="Times New Roman" w:hAnsi="Times New Roman" w:cs="Times New Roman"/>
+          <w:b/>
+          <w:bCs/>
+          <w:kern w:val="0"/>
+          <w14:ligatures w14:val="none"/>
+        </w:rPr>
+        <w:t>Business implication:</w:t>
+      </w:r>
+      <w:r>
+        <w:rPr>
+          <w:rFonts w:ascii="Times New Roman" w:eastAsia="Times New Roman" w:hAnsi="Times New Roman" w:cs="Times New Roman"/>
+          <w:kern w:val="0"/>
+          <w14:ligatures w14:val="none"/>
+        </w:rPr>
+        <w:t xml:space="preserve"> High-quality temperature/salinity/oxygen data supports reliable analysis. However, gaps in nutrient data limit our ability to assess primary productivity and </w:t>
+      </w:r>
+      <w:proofErr w:type="gramStart"/>
+      <w:r>
+        <w:rPr>
+          <w:rFonts w:ascii="Times New Roman" w:eastAsia="Times New Roman" w:hAnsi="Times New Roman" w:cs="Times New Roman"/>
+          <w:kern w:val="0"/>
+          <w14:ligatures w14:val="none"/>
+        </w:rPr>
+        <w:t>ecosystem health</w:t>
+      </w:r>
+      <w:proofErr w:type="gramEnd"/>
+      <w:r>
+        <w:rPr>
+          <w:rFonts w:ascii="Times New Roman" w:eastAsia="Times New Roman" w:hAnsi="Times New Roman" w:cs="Times New Roman"/>
+          <w:kern w:val="0"/>
+          <w14:ligatures w14:val="none"/>
+        </w:rPr>
+        <w:t xml:space="preserve"> comprehensively.</w:t>
+      </w:r>
+    </w:p>
+    <w:p>
+      <w:pPr>
+        <w:spacing w:before="100" w:beforeAutospacing="1" w:after="100" w:afterAutospacing="1" w:line="240" w:lineRule="auto"/>
+        <w:rPr>
+          <w:rFonts w:ascii="Times New Roman" w:eastAsia="Times New Roman" w:hAnsi="Times New Roman" w:cs="Times New Roman"/>
+          <w:kern w:val="0"/>
+          <w14:ligatures w14:val="none"/>
+        </w:rPr>
+      </w:pPr>
+      <w:r>
+        <w:rPr>
+          <w:rFonts w:ascii="Times New Roman" w:eastAsia="Times New Roman" w:hAnsi="Times New Roman" w:cs="Times New Roman"/>
+          <w:b/>
+          <w:bCs/>
+          <w:kern w:val="0"/>
+          <w14:ligatures w14:val="none"/>
+        </w:rPr>
+        <w:t>Recommendation:</w:t>
+      </w:r>
+      <w:r>
+        <w:rPr>
+          <w:rFonts w:ascii="Times New Roman" w:eastAsia="Times New Roman" w:hAnsi="Times New Roman" w:cs="Times New Roman"/>
+          <w:kern w:val="0"/>
+          <w14:ligatures w14:val="none"/>
+        </w:rPr>
+        <w:t xml:space="preserve"> Allocate resources to improve nutrient sampling protocols. Consider alternative measurement methods (e.g., remote sensing, modeling) to fill data gaps. Implement stricter quality control on future cruises.</w:t>
+      </w:r>
+    </w:p>
+    <w:p>
+      <w:pPr>
+        <w:rPr>
+          <w:rFonts w:ascii="Times New Roman" w:hAnsi="Times New Roman" w:cs="Times New Roman"/>
+        </w:rPr>
+      </w:pPr>
+    </w:p>
+    <w:p>
+      <w:pPr>
+        <w:rPr>
+          <w:rFonts w:ascii="Times New Roman" w:hAnsi="Times New Roman" w:cs="Times New Roman"/>
+        </w:rPr>
+      </w:pPr>
+    </w:p>
     <w:sectPr>
       <w:pgSz w:w="12240" w:h="15840"/>
       <w:pgMar w:top="1440" w:right="1440" w:bottom="1440" w:left="1440" w:header="720" w:footer="720" w:gutter="0"/>
@@ -2489,7 +3646,6 @@
     <w:next w:val="Normal"/>
     <w:link w:val="Heading3Char"/>
     <w:uiPriority w:val="9"/>
-    <w:semiHidden/>
     <w:unhideWhenUsed/>
     <w:qFormat/>
     <w:rsid w:val="003F6BA7"/>
@@ -2641,6 +3797,7 @@
   <w:style w:type="character" w:default="1" w:styleId="DefaultParagraphFont">
     <w:name w:val="Default Paragraph Font"/>
     <w:uiPriority w:val="1"/>
+    <w:semiHidden/>
     <w:unhideWhenUsed/>
   </w:style>
   <w:style w:type="table" w:default="1" w:styleId="TableNormal">
@@ -2696,7 +3853,6 @@
     <w:basedOn w:val="DefaultParagraphFont"/>
     <w:link w:val="Heading3"/>
     <w:uiPriority w:val="9"/>
-    <w:semiHidden/>
     <w:rsid w:val="003F6BA7"/>
     <w:rPr>
       <w:rFonts w:eastAsiaTheme="majorEastAsia" w:cstheme="majorBidi"/>
@@ -2952,6 +4108,30 @@
       <w:smallCaps/>
       <w:color w:val="0F4761" w:themeColor="accent1" w:themeShade="BF"/>
       <w:spacing w:val="5"/>
+    </w:rPr>
+  </w:style>
+  <w:style w:type="paragraph" w:customStyle="1" w:styleId="font-claude-response-body">
+    <w:name w:val="font-claude-response-body"/>
+    <w:basedOn w:val="Normal"/>
+    <w:rsid w:val="0077008A"/>
+    <w:pPr>
+      <w:spacing w:before="100" w:beforeAutospacing="1" w:after="100" w:afterAutospacing="1" w:line="240" w:lineRule="auto"/>
+    </w:pPr>
+    <w:rPr>
+      <w:rFonts w:ascii="Times New Roman" w:eastAsia="Times New Roman" w:hAnsi="Times New Roman" w:cs="Times New Roman"/>
+      <w:kern w:val="0"/>
+      <w14:ligatures w14:val="none"/>
+    </w:rPr>
+  </w:style>
+  <w:style w:type="character" w:styleId="Strong">
+    <w:name w:val="Strong"/>
+    <w:basedOn w:val="DefaultParagraphFont"/>
+    <w:uiPriority w:val="22"/>
+    <w:qFormat/>
+    <w:rsid w:val="0077008A"/>
+    <w:rPr>
+      <w:b/>
+      <w:bCs/>
     </w:rPr>
   </w:style>
 </w:styles>

</xml_diff>